<commit_message>
Update AURIS documents for clarity and remove temporary files
</commit_message>
<xml_diff>
--- a/docs/academic/paper/deliverables/AURIS_Kapak_Sayfasi.docx
+++ b/docs/academic/paper/deliverables/AURIS_Kapak_Sayfasi.docx
@@ -8,18 +8,17 @@
         <w:shd w:val="clear" w:color="auto" w:fill="FFFFFF"/>
         <w:spacing w:before="0" w:beforeAutospacing="0" w:after="0" w:afterAutospacing="0" w:line="360" w:lineRule="auto"/>
         <w:jc w:val="center"/>
-      </w:pPr>
-      <w:r>
-        <w:rPr>
-          <w:rStyle w:val="Gl"/>
-        </w:rPr>
-        <w:t>Türkçe makale başlığı</w:t>
-      </w:r>
-      <w:r>
-        <w:rPr>
-          <w:rStyle w:val="Gl"/>
-        </w:rPr>
-        <w:t>:</w:t>
+        <w:rPr>
+          <w:b/>
+          <w:bCs/>
+        </w:rPr>
+      </w:pPr>
+      <w:r>
+        <w:rPr>
+          <w:b/>
+          <w:bCs/>
+        </w:rPr>
+        <w:t>AURIS: Çoklu-model topluluk yaklaşımı ile yapay zekâ tarafından üretilen müziklerin tespiti</w:t>
       </w:r>
     </w:p>
     <w:p>
@@ -28,17 +27,230 @@
         <w:shd w:val="clear" w:color="auto" w:fill="FFFFFF"/>
         <w:spacing w:before="0" w:beforeAutospacing="0" w:after="0" w:afterAutospacing="0" w:line="360" w:lineRule="auto"/>
         <w:jc w:val="center"/>
-        <w:rPr>
+      </w:pPr>
+      <w:r>
+        <w:rPr>
+          <w:rStyle w:val="Gl"/>
+        </w:rPr>
+        <w:t>Yazar adları ve adres bilgileri:</w:t>
+      </w:r>
+    </w:p>
+    <w:p>
+      <w:pPr>
+        <w:spacing w:after="0" w:line="360" w:lineRule="auto"/>
+        <w:jc w:val="both"/>
+        <w:rPr>
+          <w:rFonts w:ascii="Times New Roman" w:hAnsi="Times New Roman" w:cs="Times New Roman"/>
           <w:b/>
-          <w:bCs/>
-        </w:rPr>
-      </w:pPr>
-      <w:r>
-        <w:rPr>
-          <w:b/>
-          <w:bCs/>
-        </w:rPr>
-        <w:t>AURIS: Çoklu-model topluluk yaklaşımı ile yapay zekâ tarafından üretilen müziklerin tespiti</w:t>
+          <w:sz w:val="18"/>
+          <w:szCs w:val="18"/>
+        </w:rPr>
+      </w:pPr>
+      <w:r>
+        <w:rPr>
+          <w:rFonts w:ascii="Times New Roman" w:hAnsi="Times New Roman" w:cs="Times New Roman"/>
+          <w:sz w:val="18"/>
+          <w:szCs w:val="18"/>
+          <w:shd w:val="clear" w:color="auto" w:fill="FFFFFF"/>
+        </w:rPr>
+        <w:t>H</w:t>
+      </w:r>
+      <w:r>
+        <w:rPr>
+          <w:rFonts w:ascii="Times New Roman" w:hAnsi="Times New Roman" w:cs="Times New Roman"/>
+          <w:sz w:val="18"/>
+          <w:szCs w:val="18"/>
+          <w:shd w:val="clear" w:color="auto" w:fill="FFFFFF"/>
+        </w:rPr>
+        <w:t>asan Arthur Altuntaş</w:t>
+      </w:r>
+      <w:proofErr w:type="gramStart"/>
+      <w:r>
+        <w:rPr>
+          <w:rFonts w:ascii="Times New Roman" w:hAnsi="Times New Roman" w:cs="Times New Roman"/>
+          <w:sz w:val="18"/>
+          <w:szCs w:val="18"/>
+          <w:shd w:val="clear" w:color="auto" w:fill="FFFFFF"/>
+          <w:vertAlign w:val="superscript"/>
+        </w:rPr>
+        <w:t>1,*</w:t>
+      </w:r>
+      <w:proofErr w:type="gramEnd"/>
+      <w:r>
+        <w:rPr>
+          <w:rFonts w:ascii="Times New Roman" w:hAnsi="Times New Roman" w:cs="Times New Roman"/>
+          <w:sz w:val="18"/>
+          <w:szCs w:val="18"/>
+          <w:shd w:val="clear" w:color="auto" w:fill="FFFFFF"/>
+        </w:rPr>
+        <w:t>,</w:t>
+      </w:r>
+      <w:r>
+        <w:rPr>
+          <w:rFonts w:ascii="Times New Roman" w:hAnsi="Times New Roman" w:cs="Times New Roman"/>
+          <w:sz w:val="18"/>
+          <w:szCs w:val="18"/>
+          <w:shd w:val="clear" w:color="auto" w:fill="FFFFFF"/>
+        </w:rPr>
+        <w:t xml:space="preserve"> </w:t>
+      </w:r>
+      <w:r>
+        <w:rPr>
+          <w:rFonts w:ascii="Times New Roman" w:hAnsi="Times New Roman" w:cs="Times New Roman"/>
+          <w:sz w:val="18"/>
+          <w:szCs w:val="18"/>
+          <w:shd w:val="clear" w:color="auto" w:fill="FFFFFF"/>
+        </w:rPr>
+        <w:t>Büşra Takgil</w:t>
+      </w:r>
+      <w:r>
+        <w:rPr>
+          <w:rFonts w:ascii="Times New Roman" w:hAnsi="Times New Roman" w:cs="Times New Roman"/>
+          <w:sz w:val="18"/>
+          <w:szCs w:val="18"/>
+          <w:shd w:val="clear" w:color="auto" w:fill="FFFFFF"/>
+          <w:vertAlign w:val="superscript"/>
+        </w:rPr>
+        <w:t>1</w:t>
+      </w:r>
+    </w:p>
+    <w:p>
+      <w:pPr>
+        <w:spacing w:after="0" w:line="360" w:lineRule="auto"/>
+        <w:jc w:val="both"/>
+        <w:rPr>
+          <w:rFonts w:ascii="Times New Roman" w:hAnsi="Times New Roman" w:cs="Times New Roman"/>
+          <w:sz w:val="18"/>
+          <w:szCs w:val="18"/>
+        </w:rPr>
+      </w:pPr>
+      <w:r>
+        <w:rPr>
+          <w:rFonts w:ascii="Times New Roman" w:hAnsi="Times New Roman" w:cs="Times New Roman"/>
+          <w:sz w:val="18"/>
+          <w:szCs w:val="18"/>
+          <w:shd w:val="clear" w:color="auto" w:fill="FFFFFF"/>
+          <w:vertAlign w:val="superscript"/>
+        </w:rPr>
+        <w:t>1</w:t>
+      </w:r>
+      <w:r>
+        <w:rPr>
+          <w:rFonts w:ascii="Times New Roman" w:hAnsi="Times New Roman" w:cs="Times New Roman"/>
+          <w:sz w:val="18"/>
+          <w:szCs w:val="18"/>
+        </w:rPr>
+        <w:t>Düzce Üniversitesi, Mühendislik Fakültesi, Bilgisayar Mühendisliği Bölümü, 81620, Düzce, Türkiye</w:t>
+      </w:r>
+    </w:p>
+    <w:p>
+      <w:pPr>
+        <w:spacing w:after="0" w:line="360" w:lineRule="auto"/>
+        <w:jc w:val="both"/>
+        <w:rPr>
+          <w:rFonts w:ascii="Times New Roman" w:hAnsi="Times New Roman" w:cs="Times New Roman"/>
+          <w:sz w:val="18"/>
+          <w:szCs w:val="18"/>
+          <w:shd w:val="clear" w:color="auto" w:fill="FFFFFF"/>
+        </w:rPr>
+      </w:pPr>
+      <w:r>
+        <w:rPr>
+          <w:rFonts w:ascii="Times New Roman" w:hAnsi="Times New Roman" w:cs="Times New Roman"/>
+          <w:sz w:val="18"/>
+          <w:szCs w:val="18"/>
+          <w:shd w:val="clear" w:color="auto" w:fill="FFFFFF"/>
+        </w:rPr>
+        <w:t>0009-0002-8302-7657</w:t>
+      </w:r>
+      <w:r>
+        <w:rPr>
+          <w:rFonts w:ascii="Times New Roman" w:hAnsi="Times New Roman" w:cs="Times New Roman"/>
+          <w:sz w:val="18"/>
+          <w:szCs w:val="18"/>
+          <w:shd w:val="clear" w:color="auto" w:fill="FFFFFF"/>
+        </w:rPr>
+        <w:t>,</w:t>
+      </w:r>
+      <w:r>
+        <w:rPr>
+          <w:rFonts w:ascii="Times New Roman" w:hAnsi="Times New Roman" w:cs="Times New Roman"/>
+          <w:sz w:val="18"/>
+          <w:szCs w:val="18"/>
+          <w:shd w:val="clear" w:color="auto" w:fill="FFFFFF"/>
+        </w:rPr>
+        <w:t xml:space="preserve"> </w:t>
+      </w:r>
+      <w:r>
+        <w:rPr>
+          <w:rFonts w:ascii="Times New Roman" w:hAnsi="Times New Roman" w:cs="Times New Roman"/>
+          <w:sz w:val="18"/>
+          <w:szCs w:val="18"/>
+          <w:shd w:val="clear" w:color="auto" w:fill="FFFFFF"/>
+        </w:rPr>
+        <w:t>0000-0002-7927-0083</w:t>
+      </w:r>
+    </w:p>
+    <w:p>
+      <w:pPr>
+        <w:spacing w:after="0" w:line="480" w:lineRule="auto"/>
+        <w:rPr>
+          <w:rFonts w:ascii="Times New Roman" w:hAnsi="Times New Roman" w:cs="Times New Roman"/>
+          <w:sz w:val="18"/>
+          <w:szCs w:val="18"/>
+        </w:rPr>
+      </w:pPr>
+      <w:r>
+        <w:rPr>
+          <w:rFonts w:ascii="Times New Roman" w:hAnsi="Times New Roman" w:cs="Times New Roman"/>
+          <w:sz w:val="18"/>
+          <w:szCs w:val="18"/>
+        </w:rPr>
+        <w:t xml:space="preserve">hasannarthurrr@gmail.com, </w:t>
+      </w:r>
+    </w:p>
+    <w:p>
+      <w:pPr>
+        <w:spacing w:after="0" w:line="480" w:lineRule="auto"/>
+        <w:rPr>
+          <w:rFonts w:ascii="Times New Roman" w:hAnsi="Times New Roman" w:cs="Times New Roman"/>
+          <w:sz w:val="18"/>
+          <w:szCs w:val="18"/>
+        </w:rPr>
+      </w:pPr>
+      <w:r>
+        <w:rPr>
+          <w:rFonts w:ascii="Times New Roman" w:hAnsi="Times New Roman" w:cs="Times New Roman"/>
+          <w:sz w:val="18"/>
+          <w:szCs w:val="18"/>
+        </w:rPr>
+        <w:t xml:space="preserve">İletişim yazarı telefon </w:t>
+      </w:r>
+      <w:proofErr w:type="spellStart"/>
+      <w:r>
+        <w:rPr>
+          <w:rFonts w:ascii="Times New Roman" w:hAnsi="Times New Roman" w:cs="Times New Roman"/>
+          <w:sz w:val="18"/>
+          <w:szCs w:val="18"/>
+        </w:rPr>
+        <w:t>no</w:t>
+      </w:r>
+      <w:proofErr w:type="spellEnd"/>
+      <w:r>
+        <w:rPr>
+          <w:rFonts w:ascii="Times New Roman" w:hAnsi="Times New Roman" w:cs="Times New Roman"/>
+          <w:sz w:val="18"/>
+          <w:szCs w:val="18"/>
+        </w:rPr>
+        <w:t xml:space="preserve">: </w:t>
+      </w:r>
+      <w:r>
+        <w:rPr>
+          <w:rFonts w:ascii="Times New Roman" w:hAnsi="Times New Roman" w:cs="Times New Roman"/>
+          <w:sz w:val="18"/>
+          <w:szCs w:val="18"/>
+        </w:rPr>
+        <w:t xml:space="preserve">5304757690, </w:t>
       </w:r>
     </w:p>
     <w:p>
@@ -48,230 +260,6 @@
         <w:spacing w:before="0" w:beforeAutospacing="0" w:after="0" w:afterAutospacing="0" w:line="360" w:lineRule="auto"/>
         <w:jc w:val="center"/>
       </w:pPr>
-      <w:r>
-        <w:rPr>
-          <w:rStyle w:val="Gl"/>
-        </w:rPr>
-        <w:t>Yazar adları ve adres bilgileri:</w:t>
-      </w:r>
-    </w:p>
-    <w:p>
-      <w:pPr>
-        <w:spacing w:after="0" w:line="360" w:lineRule="auto"/>
-        <w:jc w:val="both"/>
-        <w:rPr>
-          <w:rFonts w:ascii="Times New Roman" w:hAnsi="Times New Roman" w:cs="Times New Roman"/>
-          <w:b/>
-          <w:sz w:val="18"/>
-          <w:szCs w:val="18"/>
-        </w:rPr>
-      </w:pPr>
-      <w:r>
-        <w:rPr>
-          <w:rFonts w:ascii="Times New Roman" w:hAnsi="Times New Roman" w:cs="Times New Roman"/>
-          <w:sz w:val="18"/>
-          <w:szCs w:val="18"/>
-          <w:shd w:val="clear" w:color="auto" w:fill="FFFFFF"/>
-        </w:rPr>
-        <w:t>H</w:t>
-      </w:r>
-      <w:r>
-        <w:rPr>
-          <w:rFonts w:ascii="Times New Roman" w:hAnsi="Times New Roman" w:cs="Times New Roman"/>
-          <w:sz w:val="18"/>
-          <w:szCs w:val="18"/>
-          <w:shd w:val="clear" w:color="auto" w:fill="FFFFFF"/>
-        </w:rPr>
-        <w:t>asan Arthur Altuntaş</w:t>
-      </w:r>
-      <w:proofErr w:type="gramStart"/>
-      <w:r>
-        <w:rPr>
-          <w:rFonts w:ascii="Times New Roman" w:hAnsi="Times New Roman" w:cs="Times New Roman"/>
-          <w:sz w:val="18"/>
-          <w:szCs w:val="18"/>
-          <w:shd w:val="clear" w:color="auto" w:fill="FFFFFF"/>
-          <w:vertAlign w:val="superscript"/>
-        </w:rPr>
-        <w:t>1,*</w:t>
-      </w:r>
-      <w:proofErr w:type="gramEnd"/>
-      <w:r>
-        <w:rPr>
-          <w:rFonts w:ascii="Times New Roman" w:hAnsi="Times New Roman" w:cs="Times New Roman"/>
-          <w:sz w:val="18"/>
-          <w:szCs w:val="18"/>
-          <w:shd w:val="clear" w:color="auto" w:fill="FFFFFF"/>
-        </w:rPr>
-        <w:t>,</w:t>
-      </w:r>
-      <w:r>
-        <w:rPr>
-          <w:rFonts w:ascii="Times New Roman" w:hAnsi="Times New Roman" w:cs="Times New Roman"/>
-          <w:sz w:val="18"/>
-          <w:szCs w:val="18"/>
-          <w:shd w:val="clear" w:color="auto" w:fill="FFFFFF"/>
-        </w:rPr>
-        <w:t xml:space="preserve"> </w:t>
-      </w:r>
-      <w:r>
-        <w:rPr>
-          <w:rFonts w:ascii="Times New Roman" w:hAnsi="Times New Roman" w:cs="Times New Roman"/>
-          <w:sz w:val="18"/>
-          <w:szCs w:val="18"/>
-          <w:shd w:val="clear" w:color="auto" w:fill="FFFFFF"/>
-        </w:rPr>
-        <w:t>Büşra Takgil</w:t>
-      </w:r>
-      <w:r>
-        <w:rPr>
-          <w:rFonts w:ascii="Times New Roman" w:hAnsi="Times New Roman" w:cs="Times New Roman"/>
-          <w:sz w:val="18"/>
-          <w:szCs w:val="18"/>
-          <w:shd w:val="clear" w:color="auto" w:fill="FFFFFF"/>
-          <w:vertAlign w:val="superscript"/>
-        </w:rPr>
-        <w:t>1</w:t>
-      </w:r>
-    </w:p>
-    <w:p>
-      <w:pPr>
-        <w:spacing w:after="0" w:line="360" w:lineRule="auto"/>
-        <w:jc w:val="both"/>
-        <w:rPr>
-          <w:rFonts w:ascii="Times New Roman" w:hAnsi="Times New Roman" w:cs="Times New Roman"/>
-          <w:sz w:val="18"/>
-          <w:szCs w:val="18"/>
-        </w:rPr>
-      </w:pPr>
-      <w:r>
-        <w:rPr>
-          <w:rFonts w:ascii="Times New Roman" w:hAnsi="Times New Roman" w:cs="Times New Roman"/>
-          <w:sz w:val="18"/>
-          <w:szCs w:val="18"/>
-          <w:shd w:val="clear" w:color="auto" w:fill="FFFFFF"/>
-          <w:vertAlign w:val="superscript"/>
-        </w:rPr>
-        <w:t>1</w:t>
-      </w:r>
-      <w:r>
-        <w:rPr>
-          <w:rFonts w:ascii="Times New Roman" w:hAnsi="Times New Roman" w:cs="Times New Roman"/>
-          <w:sz w:val="18"/>
-          <w:szCs w:val="18"/>
-        </w:rPr>
-        <w:t>Düzce Üniversitesi, Mühendislik Fakültesi, Bilgisayar Mühendisliği Bölümü, 81620, Düzce, Türkiye</w:t>
-      </w:r>
-    </w:p>
-    <w:p>
-      <w:pPr>
-        <w:spacing w:after="0" w:line="360" w:lineRule="auto"/>
-        <w:jc w:val="both"/>
-        <w:rPr>
-          <w:rFonts w:ascii="Times New Roman" w:hAnsi="Times New Roman" w:cs="Times New Roman"/>
-          <w:sz w:val="18"/>
-          <w:szCs w:val="18"/>
-          <w:shd w:val="clear" w:color="auto" w:fill="FFFFFF"/>
-        </w:rPr>
-      </w:pPr>
-      <w:r>
-        <w:rPr>
-          <w:rFonts w:ascii="Times New Roman" w:hAnsi="Times New Roman" w:cs="Times New Roman"/>
-          <w:sz w:val="18"/>
-          <w:szCs w:val="18"/>
-          <w:shd w:val="clear" w:color="auto" w:fill="FFFFFF"/>
-        </w:rPr>
-        <w:t>0009-0002-8302-7657</w:t>
-      </w:r>
-      <w:r>
-        <w:rPr>
-          <w:rFonts w:ascii="Times New Roman" w:hAnsi="Times New Roman" w:cs="Times New Roman"/>
-          <w:sz w:val="18"/>
-          <w:szCs w:val="18"/>
-          <w:shd w:val="clear" w:color="auto" w:fill="FFFFFF"/>
-        </w:rPr>
-        <w:t>,</w:t>
-      </w:r>
-      <w:r>
-        <w:rPr>
-          <w:rFonts w:ascii="Times New Roman" w:hAnsi="Times New Roman" w:cs="Times New Roman"/>
-          <w:sz w:val="18"/>
-          <w:szCs w:val="18"/>
-          <w:shd w:val="clear" w:color="auto" w:fill="FFFFFF"/>
-        </w:rPr>
-        <w:t xml:space="preserve"> </w:t>
-      </w:r>
-      <w:r>
-        <w:rPr>
-          <w:rFonts w:ascii="Times New Roman" w:hAnsi="Times New Roman" w:cs="Times New Roman"/>
-          <w:sz w:val="18"/>
-          <w:szCs w:val="18"/>
-          <w:shd w:val="clear" w:color="auto" w:fill="FFFFFF"/>
-        </w:rPr>
-        <w:t>0000-0002-7927-0083</w:t>
-      </w:r>
-    </w:p>
-    <w:p>
-      <w:pPr>
-        <w:spacing w:after="0" w:line="480" w:lineRule="auto"/>
-        <w:rPr>
-          <w:rFonts w:ascii="Times New Roman" w:hAnsi="Times New Roman" w:cs="Times New Roman"/>
-          <w:sz w:val="18"/>
-          <w:szCs w:val="18"/>
-        </w:rPr>
-      </w:pPr>
-      <w:r>
-        <w:rPr>
-          <w:rFonts w:ascii="Times New Roman" w:hAnsi="Times New Roman" w:cs="Times New Roman"/>
-          <w:sz w:val="18"/>
-          <w:szCs w:val="18"/>
-        </w:rPr>
-        <w:t xml:space="preserve">hasannarthurrr@gmail.com, </w:t>
-      </w:r>
-    </w:p>
-    <w:p>
-      <w:pPr>
-        <w:spacing w:after="0" w:line="480" w:lineRule="auto"/>
-        <w:rPr>
-          <w:rFonts w:ascii="Times New Roman" w:hAnsi="Times New Roman" w:cs="Times New Roman"/>
-          <w:sz w:val="18"/>
-          <w:szCs w:val="18"/>
-        </w:rPr>
-      </w:pPr>
-      <w:r>
-        <w:rPr>
-          <w:rFonts w:ascii="Times New Roman" w:hAnsi="Times New Roman" w:cs="Times New Roman"/>
-          <w:sz w:val="18"/>
-          <w:szCs w:val="18"/>
-        </w:rPr>
-        <w:t xml:space="preserve">İletişim yazarı telefon </w:t>
-      </w:r>
-      <w:proofErr w:type="spellStart"/>
-      <w:r>
-        <w:rPr>
-          <w:rFonts w:ascii="Times New Roman" w:hAnsi="Times New Roman" w:cs="Times New Roman"/>
-          <w:sz w:val="18"/>
-          <w:szCs w:val="18"/>
-        </w:rPr>
-        <w:t>no</w:t>
-      </w:r>
-      <w:proofErr w:type="spellEnd"/>
-      <w:r>
-        <w:rPr>
-          <w:rFonts w:ascii="Times New Roman" w:hAnsi="Times New Roman" w:cs="Times New Roman"/>
-          <w:sz w:val="18"/>
-          <w:szCs w:val="18"/>
-        </w:rPr>
-        <w:t xml:space="preserve">: </w:t>
-      </w:r>
-      <w:r>
-        <w:rPr>
-          <w:rFonts w:ascii="Times New Roman" w:hAnsi="Times New Roman" w:cs="Times New Roman"/>
-          <w:sz w:val="18"/>
-          <w:szCs w:val="18"/>
-        </w:rPr>
-        <w:t xml:space="preserve">5304757690, </w:t>
-      </w:r>
     </w:p>
     <w:p>
       <w:pPr>
@@ -287,44 +275,10 @@
         <w:shd w:val="clear" w:color="auto" w:fill="FFFFFF"/>
         <w:spacing w:before="0" w:beforeAutospacing="0" w:after="0" w:afterAutospacing="0" w:line="360" w:lineRule="auto"/>
         <w:jc w:val="center"/>
-      </w:pPr>
-    </w:p>
-    <w:p>
-      <w:pPr>
-        <w:pStyle w:val="NormalWeb"/>
-        <w:shd w:val="clear" w:color="auto" w:fill="FFFFFF"/>
-        <w:spacing w:before="0" w:beforeAutospacing="0" w:after="0" w:afterAutospacing="0" w:line="360" w:lineRule="auto"/>
-        <w:jc w:val="center"/>
-      </w:pPr>
-      <w:r>
         <w:rPr>
           <w:rStyle w:val="Gl"/>
         </w:rPr>
-        <w:t>İngilizce makale başlığı</w:t>
-      </w:r>
-      <w:r>
-        <w:rPr>
-          <w:rStyle w:val="Gl"/>
-        </w:rPr>
-        <w:t>:</w:t>
-      </w:r>
-    </w:p>
-    <w:p>
-      <w:pPr>
-        <w:pStyle w:val="NormalWeb"/>
-        <w:shd w:val="clear" w:color="auto" w:fill="FFFFFF"/>
-        <w:spacing w:before="0" w:beforeAutospacing="0" w:after="0" w:afterAutospacing="0" w:line="360" w:lineRule="auto"/>
-        <w:jc w:val="center"/>
-        <w:rPr>
-          <w:rStyle w:val="Gl"/>
-        </w:rPr>
-      </w:pPr>
-      <w:r>
-        <w:rPr>
-          <w:lang w:val="en-US"/>
-        </w:rPr>
-        <w:t xml:space="preserve"> </w:t>
-      </w:r>
+      </w:pPr>
       <w:r>
         <w:rPr>
           <w:b/>

</xml_diff>

<commit_message>
Add new deliverable documents and update existing ones
- Created new document ~\$RIS_Kapak_Sayfasi.docx with initial content.
- Created new document ~\$RIS_Makale_Metni.docx with initial content.
- Updated existing document ~\$nzerlik.docx with modified content.
</commit_message>
<xml_diff>
--- a/docs/academic/paper/deliverables/AURIS_Kapak_Sayfasi.docx
+++ b/docs/academic/paper/deliverables/AURIS_Kapak_Sayfasi.docx
@@ -23,235 +23,232 @@
     </w:p>
     <w:p>
       <w:pPr>
+        <w:spacing w:after="0" w:line="360" w:lineRule="auto"/>
+        <w:jc w:val="both"/>
+        <w:rPr>
+          <w:rFonts w:ascii="Times New Roman" w:hAnsi="Times New Roman" w:cs="Times New Roman"/>
+          <w:b/>
+          <w:sz w:val="18"/>
+          <w:szCs w:val="18"/>
+        </w:rPr>
+      </w:pPr>
+      <w:r>
+        <w:rPr>
+          <w:rFonts w:ascii="Times New Roman" w:hAnsi="Times New Roman" w:cs="Times New Roman"/>
+          <w:sz w:val="18"/>
+          <w:szCs w:val="18"/>
+          <w:shd w:val="clear" w:color="auto" w:fill="FFFFFF"/>
+        </w:rPr>
+        <w:t>H</w:t>
+      </w:r>
+      <w:r>
+        <w:rPr>
+          <w:rFonts w:ascii="Times New Roman" w:hAnsi="Times New Roman" w:cs="Times New Roman"/>
+          <w:sz w:val="18"/>
+          <w:szCs w:val="18"/>
+          <w:shd w:val="clear" w:color="auto" w:fill="FFFFFF"/>
+        </w:rPr>
+        <w:t>asan Arthur Altuntaş</w:t>
+      </w:r>
+      <w:proofErr w:type="gramStart"/>
+      <w:r>
+        <w:rPr>
+          <w:rFonts w:ascii="Times New Roman" w:hAnsi="Times New Roman" w:cs="Times New Roman"/>
+          <w:sz w:val="18"/>
+          <w:szCs w:val="18"/>
+          <w:shd w:val="clear" w:color="auto" w:fill="FFFFFF"/>
+          <w:vertAlign w:val="superscript"/>
+        </w:rPr>
+        <w:t>1,*</w:t>
+      </w:r>
+      <w:proofErr w:type="gramEnd"/>
+      <w:r>
+        <w:rPr>
+          <w:rFonts w:ascii="Times New Roman" w:hAnsi="Times New Roman" w:cs="Times New Roman"/>
+          <w:sz w:val="18"/>
+          <w:szCs w:val="18"/>
+          <w:shd w:val="clear" w:color="auto" w:fill="FFFFFF"/>
+        </w:rPr>
+        <w:t>,</w:t>
+      </w:r>
+      <w:r>
+        <w:rPr>
+          <w:rFonts w:ascii="Times New Roman" w:hAnsi="Times New Roman" w:cs="Times New Roman"/>
+          <w:sz w:val="18"/>
+          <w:szCs w:val="18"/>
+          <w:shd w:val="clear" w:color="auto" w:fill="FFFFFF"/>
+        </w:rPr>
+        <w:t xml:space="preserve"> </w:t>
+      </w:r>
+      <w:r>
+        <w:rPr>
+          <w:rFonts w:ascii="Times New Roman" w:hAnsi="Times New Roman" w:cs="Times New Roman"/>
+          <w:sz w:val="18"/>
+          <w:szCs w:val="18"/>
+          <w:shd w:val="clear" w:color="auto" w:fill="FFFFFF"/>
+        </w:rPr>
+        <w:t>Büşra Takgil</w:t>
+      </w:r>
+      <w:r>
+        <w:rPr>
+          <w:rFonts w:ascii="Times New Roman" w:hAnsi="Times New Roman" w:cs="Times New Roman"/>
+          <w:sz w:val="18"/>
+          <w:szCs w:val="18"/>
+          <w:shd w:val="clear" w:color="auto" w:fill="FFFFFF"/>
+          <w:vertAlign w:val="superscript"/>
+        </w:rPr>
+        <w:t>1</w:t>
+      </w:r>
+    </w:p>
+    <w:p>
+      <w:pPr>
+        <w:spacing w:after="0" w:line="360" w:lineRule="auto"/>
+        <w:jc w:val="both"/>
+        <w:rPr>
+          <w:rFonts w:ascii="Times New Roman" w:hAnsi="Times New Roman" w:cs="Times New Roman"/>
+          <w:sz w:val="18"/>
+          <w:szCs w:val="18"/>
+        </w:rPr>
+      </w:pPr>
+      <w:r>
+        <w:rPr>
+          <w:rFonts w:ascii="Times New Roman" w:hAnsi="Times New Roman" w:cs="Times New Roman"/>
+          <w:sz w:val="18"/>
+          <w:szCs w:val="18"/>
+          <w:shd w:val="clear" w:color="auto" w:fill="FFFFFF"/>
+          <w:vertAlign w:val="superscript"/>
+        </w:rPr>
+        <w:t>1</w:t>
+      </w:r>
+      <w:r>
+        <w:rPr>
+          <w:rFonts w:ascii="Times New Roman" w:hAnsi="Times New Roman" w:cs="Times New Roman"/>
+          <w:sz w:val="18"/>
+          <w:szCs w:val="18"/>
+        </w:rPr>
+        <w:t>Düzce Üniversitesi, Mühendislik Fakültesi, Bilgisayar Mühendisliği Bölümü, 81620, Düzce, Türkiye</w:t>
+      </w:r>
+    </w:p>
+    <w:p>
+      <w:pPr>
+        <w:spacing w:after="0" w:line="360" w:lineRule="auto"/>
+        <w:jc w:val="both"/>
+        <w:rPr>
+          <w:rFonts w:ascii="Times New Roman" w:hAnsi="Times New Roman" w:cs="Times New Roman"/>
+          <w:sz w:val="18"/>
+          <w:szCs w:val="18"/>
+          <w:shd w:val="clear" w:color="auto" w:fill="FFFFFF"/>
+        </w:rPr>
+      </w:pPr>
+      <w:r>
+        <w:rPr>
+          <w:rFonts w:ascii="Times New Roman" w:hAnsi="Times New Roman" w:cs="Times New Roman"/>
+          <w:sz w:val="18"/>
+          <w:szCs w:val="18"/>
+          <w:shd w:val="clear" w:color="auto" w:fill="FFFFFF"/>
+        </w:rPr>
+        <w:t>0009-0002-8302-7657</w:t>
+      </w:r>
+      <w:r>
+        <w:rPr>
+          <w:rFonts w:ascii="Times New Roman" w:hAnsi="Times New Roman" w:cs="Times New Roman"/>
+          <w:sz w:val="18"/>
+          <w:szCs w:val="18"/>
+          <w:shd w:val="clear" w:color="auto" w:fill="FFFFFF"/>
+        </w:rPr>
+        <w:t>,</w:t>
+      </w:r>
+      <w:r>
+        <w:rPr>
+          <w:rFonts w:ascii="Times New Roman" w:hAnsi="Times New Roman" w:cs="Times New Roman"/>
+          <w:sz w:val="18"/>
+          <w:szCs w:val="18"/>
+          <w:shd w:val="clear" w:color="auto" w:fill="FFFFFF"/>
+        </w:rPr>
+        <w:t xml:space="preserve"> </w:t>
+      </w:r>
+      <w:r>
+        <w:rPr>
+          <w:rFonts w:ascii="Times New Roman" w:hAnsi="Times New Roman" w:cs="Times New Roman"/>
+          <w:sz w:val="18"/>
+          <w:szCs w:val="18"/>
+          <w:shd w:val="clear" w:color="auto" w:fill="FFFFFF"/>
+        </w:rPr>
+        <w:t>0000-0002-7927-0083</w:t>
+      </w:r>
+    </w:p>
+    <w:p>
+      <w:pPr>
+        <w:spacing w:after="0" w:line="480" w:lineRule="auto"/>
+        <w:rPr>
+          <w:rFonts w:ascii="Times New Roman" w:hAnsi="Times New Roman" w:cs="Times New Roman"/>
+          <w:sz w:val="18"/>
+          <w:szCs w:val="18"/>
+        </w:rPr>
+      </w:pPr>
+      <w:r>
+        <w:rPr>
+          <w:rFonts w:ascii="Times New Roman" w:hAnsi="Times New Roman" w:cs="Times New Roman"/>
+          <w:sz w:val="18"/>
+          <w:szCs w:val="18"/>
+        </w:rPr>
+        <w:t xml:space="preserve">hasannarthurrr@gmail.com, </w:t>
+      </w:r>
+      <w:r>
+        <w:rPr>
+          <w:rFonts w:ascii="Times New Roman" w:hAnsi="Times New Roman" w:cs="Times New Roman"/>
+          <w:sz w:val="18"/>
+          <w:szCs w:val="18"/>
+        </w:rPr>
+        <w:t>busratakgil@duzce.edu.tr</w:t>
+      </w:r>
+    </w:p>
+    <w:p>
+      <w:pPr>
+        <w:spacing w:after="0" w:line="480" w:lineRule="auto"/>
+      </w:pPr>
+      <w:r>
+        <w:rPr>
+          <w:rFonts w:ascii="Times New Roman" w:hAnsi="Times New Roman" w:cs="Times New Roman"/>
+          <w:sz w:val="18"/>
+          <w:szCs w:val="18"/>
+        </w:rPr>
+        <w:t xml:space="preserve">İletişim yazarı telefon </w:t>
+      </w:r>
+      <w:proofErr w:type="spellStart"/>
+      <w:r>
+        <w:rPr>
+          <w:rFonts w:ascii="Times New Roman" w:hAnsi="Times New Roman" w:cs="Times New Roman"/>
+          <w:sz w:val="18"/>
+          <w:szCs w:val="18"/>
+        </w:rPr>
+        <w:t>no</w:t>
+      </w:r>
+      <w:proofErr w:type="spellEnd"/>
+      <w:r>
+        <w:rPr>
+          <w:rFonts w:ascii="Times New Roman" w:hAnsi="Times New Roman" w:cs="Times New Roman"/>
+          <w:sz w:val="18"/>
+          <w:szCs w:val="18"/>
+        </w:rPr>
+        <w:t xml:space="preserve">: </w:t>
+      </w:r>
+      <w:r>
+        <w:rPr>
+          <w:rFonts w:ascii="Times New Roman" w:hAnsi="Times New Roman" w:cs="Times New Roman"/>
+          <w:sz w:val="18"/>
+          <w:szCs w:val="18"/>
+        </w:rPr>
+        <w:t>5304757690</w:t>
+      </w:r>
+    </w:p>
+    <w:p>
+      <w:pPr>
         <w:pStyle w:val="NormalWeb"/>
         <w:shd w:val="clear" w:color="auto" w:fill="FFFFFF"/>
         <w:spacing w:before="0" w:beforeAutospacing="0" w:after="0" w:afterAutospacing="0" w:line="360" w:lineRule="auto"/>
         <w:jc w:val="center"/>
       </w:pPr>
-      <w:r>
-        <w:rPr>
-          <w:rStyle w:val="Gl"/>
-        </w:rPr>
-        <w:t>Yazar adları ve adres bilgileri:</w:t>
-      </w:r>
-    </w:p>
-    <w:p>
-      <w:pPr>
-        <w:spacing w:after="0" w:line="360" w:lineRule="auto"/>
-        <w:jc w:val="both"/>
-        <w:rPr>
-          <w:rFonts w:ascii="Times New Roman" w:hAnsi="Times New Roman" w:cs="Times New Roman"/>
-          <w:b/>
-          <w:sz w:val="18"/>
-          <w:szCs w:val="18"/>
-        </w:rPr>
-      </w:pPr>
-      <w:r>
-        <w:rPr>
-          <w:rFonts w:ascii="Times New Roman" w:hAnsi="Times New Roman" w:cs="Times New Roman"/>
-          <w:sz w:val="18"/>
-          <w:szCs w:val="18"/>
-          <w:shd w:val="clear" w:color="auto" w:fill="FFFFFF"/>
-        </w:rPr>
-        <w:t>H</w:t>
-      </w:r>
-      <w:r>
-        <w:rPr>
-          <w:rFonts w:ascii="Times New Roman" w:hAnsi="Times New Roman" w:cs="Times New Roman"/>
-          <w:sz w:val="18"/>
-          <w:szCs w:val="18"/>
-          <w:shd w:val="clear" w:color="auto" w:fill="FFFFFF"/>
-        </w:rPr>
-        <w:t>asan Arthur Altuntaş</w:t>
-      </w:r>
-      <w:proofErr w:type="gramStart"/>
-      <w:r>
-        <w:rPr>
-          <w:rFonts w:ascii="Times New Roman" w:hAnsi="Times New Roman" w:cs="Times New Roman"/>
-          <w:sz w:val="18"/>
-          <w:szCs w:val="18"/>
-          <w:shd w:val="clear" w:color="auto" w:fill="FFFFFF"/>
-          <w:vertAlign w:val="superscript"/>
-        </w:rPr>
-        <w:t>1,*</w:t>
-      </w:r>
-      <w:proofErr w:type="gramEnd"/>
-      <w:r>
-        <w:rPr>
-          <w:rFonts w:ascii="Times New Roman" w:hAnsi="Times New Roman" w:cs="Times New Roman"/>
-          <w:sz w:val="18"/>
-          <w:szCs w:val="18"/>
-          <w:shd w:val="clear" w:color="auto" w:fill="FFFFFF"/>
-        </w:rPr>
-        <w:t>,</w:t>
-      </w:r>
-      <w:r>
-        <w:rPr>
-          <w:rFonts w:ascii="Times New Roman" w:hAnsi="Times New Roman" w:cs="Times New Roman"/>
-          <w:sz w:val="18"/>
-          <w:szCs w:val="18"/>
-          <w:shd w:val="clear" w:color="auto" w:fill="FFFFFF"/>
-        </w:rPr>
-        <w:t xml:space="preserve"> </w:t>
-      </w:r>
-      <w:r>
-        <w:rPr>
-          <w:rFonts w:ascii="Times New Roman" w:hAnsi="Times New Roman" w:cs="Times New Roman"/>
-          <w:sz w:val="18"/>
-          <w:szCs w:val="18"/>
-          <w:shd w:val="clear" w:color="auto" w:fill="FFFFFF"/>
-        </w:rPr>
-        <w:t>Büşra Takgil</w:t>
-      </w:r>
-      <w:r>
-        <w:rPr>
-          <w:rFonts w:ascii="Times New Roman" w:hAnsi="Times New Roman" w:cs="Times New Roman"/>
-          <w:sz w:val="18"/>
-          <w:szCs w:val="18"/>
-          <w:shd w:val="clear" w:color="auto" w:fill="FFFFFF"/>
-          <w:vertAlign w:val="superscript"/>
-        </w:rPr>
-        <w:t>1</w:t>
-      </w:r>
-    </w:p>
-    <w:p>
-      <w:pPr>
-        <w:spacing w:after="0" w:line="360" w:lineRule="auto"/>
-        <w:jc w:val="both"/>
-        <w:rPr>
-          <w:rFonts w:ascii="Times New Roman" w:hAnsi="Times New Roman" w:cs="Times New Roman"/>
-          <w:sz w:val="18"/>
-          <w:szCs w:val="18"/>
-        </w:rPr>
-      </w:pPr>
-      <w:r>
-        <w:rPr>
-          <w:rFonts w:ascii="Times New Roman" w:hAnsi="Times New Roman" w:cs="Times New Roman"/>
-          <w:sz w:val="18"/>
-          <w:szCs w:val="18"/>
-          <w:shd w:val="clear" w:color="auto" w:fill="FFFFFF"/>
-          <w:vertAlign w:val="superscript"/>
-        </w:rPr>
-        <w:t>1</w:t>
-      </w:r>
-      <w:r>
-        <w:rPr>
-          <w:rFonts w:ascii="Times New Roman" w:hAnsi="Times New Roman" w:cs="Times New Roman"/>
-          <w:sz w:val="18"/>
-          <w:szCs w:val="18"/>
-        </w:rPr>
-        <w:t>Düzce Üniversitesi, Mühendislik Fakültesi, Bilgisayar Mühendisliği Bölümü, 81620, Düzce, Türkiye</w:t>
-      </w:r>
-    </w:p>
-    <w:p>
-      <w:pPr>
-        <w:spacing w:after="0" w:line="360" w:lineRule="auto"/>
-        <w:jc w:val="both"/>
-        <w:rPr>
-          <w:rFonts w:ascii="Times New Roman" w:hAnsi="Times New Roman" w:cs="Times New Roman"/>
-          <w:sz w:val="18"/>
-          <w:szCs w:val="18"/>
-          <w:shd w:val="clear" w:color="auto" w:fill="FFFFFF"/>
-        </w:rPr>
-      </w:pPr>
-      <w:r>
-        <w:rPr>
-          <w:rFonts w:ascii="Times New Roman" w:hAnsi="Times New Roman" w:cs="Times New Roman"/>
-          <w:sz w:val="18"/>
-          <w:szCs w:val="18"/>
-          <w:shd w:val="clear" w:color="auto" w:fill="FFFFFF"/>
-        </w:rPr>
-        <w:t>0009-0002-8302-7657</w:t>
-      </w:r>
-      <w:r>
-        <w:rPr>
-          <w:rFonts w:ascii="Times New Roman" w:hAnsi="Times New Roman" w:cs="Times New Roman"/>
-          <w:sz w:val="18"/>
-          <w:szCs w:val="18"/>
-          <w:shd w:val="clear" w:color="auto" w:fill="FFFFFF"/>
-        </w:rPr>
-        <w:t>,</w:t>
-      </w:r>
-      <w:r>
-        <w:rPr>
-          <w:rFonts w:ascii="Times New Roman" w:hAnsi="Times New Roman" w:cs="Times New Roman"/>
-          <w:sz w:val="18"/>
-          <w:szCs w:val="18"/>
-          <w:shd w:val="clear" w:color="auto" w:fill="FFFFFF"/>
-        </w:rPr>
-        <w:t xml:space="preserve"> </w:t>
-      </w:r>
-      <w:r>
-        <w:rPr>
-          <w:rFonts w:ascii="Times New Roman" w:hAnsi="Times New Roman" w:cs="Times New Roman"/>
-          <w:sz w:val="18"/>
-          <w:szCs w:val="18"/>
-          <w:shd w:val="clear" w:color="auto" w:fill="FFFFFF"/>
-        </w:rPr>
-        <w:t>0000-0002-7927-0083</w:t>
-      </w:r>
-    </w:p>
-    <w:p>
-      <w:pPr>
-        <w:spacing w:after="0" w:line="480" w:lineRule="auto"/>
-        <w:rPr>
-          <w:rFonts w:ascii="Times New Roman" w:hAnsi="Times New Roman" w:cs="Times New Roman"/>
-          <w:sz w:val="18"/>
-          <w:szCs w:val="18"/>
-        </w:rPr>
-      </w:pPr>
-      <w:r>
-        <w:rPr>
-          <w:rFonts w:ascii="Times New Roman" w:hAnsi="Times New Roman" w:cs="Times New Roman"/>
-          <w:sz w:val="18"/>
-          <w:szCs w:val="18"/>
-        </w:rPr>
-        <w:t xml:space="preserve">hasannarthurrr@gmail.com, </w:t>
-      </w:r>
-    </w:p>
-    <w:p>
-      <w:pPr>
-        <w:spacing w:after="0" w:line="480" w:lineRule="auto"/>
-        <w:rPr>
-          <w:rFonts w:ascii="Times New Roman" w:hAnsi="Times New Roman" w:cs="Times New Roman"/>
-          <w:sz w:val="18"/>
-          <w:szCs w:val="18"/>
-        </w:rPr>
-      </w:pPr>
-      <w:r>
-        <w:rPr>
-          <w:rFonts w:ascii="Times New Roman" w:hAnsi="Times New Roman" w:cs="Times New Roman"/>
-          <w:sz w:val="18"/>
-          <w:szCs w:val="18"/>
-        </w:rPr>
-        <w:t xml:space="preserve">İletişim yazarı telefon </w:t>
-      </w:r>
-      <w:proofErr w:type="spellStart"/>
-      <w:r>
-        <w:rPr>
-          <w:rFonts w:ascii="Times New Roman" w:hAnsi="Times New Roman" w:cs="Times New Roman"/>
-          <w:sz w:val="18"/>
-          <w:szCs w:val="18"/>
-        </w:rPr>
-        <w:t>no</w:t>
-      </w:r>
-      <w:proofErr w:type="spellEnd"/>
-      <w:r>
-        <w:rPr>
-          <w:rFonts w:ascii="Times New Roman" w:hAnsi="Times New Roman" w:cs="Times New Roman"/>
-          <w:sz w:val="18"/>
-          <w:szCs w:val="18"/>
-        </w:rPr>
-        <w:t xml:space="preserve">: </w:t>
-      </w:r>
-      <w:r>
-        <w:rPr>
-          <w:rFonts w:ascii="Times New Roman" w:hAnsi="Times New Roman" w:cs="Times New Roman"/>
-          <w:sz w:val="18"/>
-          <w:szCs w:val="18"/>
-        </w:rPr>
-        <w:t xml:space="preserve">5304757690, </w:t>
-      </w:r>
     </w:p>
     <w:p>
       <w:pPr>
@@ -259,7 +256,18 @@
         <w:shd w:val="clear" w:color="auto" w:fill="FFFFFF"/>
         <w:spacing w:before="0" w:beforeAutospacing="0" w:after="0" w:afterAutospacing="0" w:line="360" w:lineRule="auto"/>
         <w:jc w:val="center"/>
-      </w:pPr>
+        <w:rPr>
+          <w:rStyle w:val="Gl"/>
+        </w:rPr>
+      </w:pPr>
+      <w:r>
+        <w:rPr>
+          <w:b/>
+          <w:bCs/>
+          <w:lang w:val="en-US"/>
+        </w:rPr>
+        <w:t>AURIS: A multi-model ensemble approach for the detection of AI-generated music</w:t>
+      </w:r>
     </w:p>
     <w:p>
       <w:pPr>
@@ -267,160 +275,251 @@
         <w:shd w:val="clear" w:color="auto" w:fill="FFFFFF"/>
         <w:spacing w:before="0" w:beforeAutospacing="0" w:after="0" w:afterAutospacing="0" w:line="360" w:lineRule="auto"/>
         <w:jc w:val="center"/>
+        <w:rPr>
+          <w:rStyle w:val="Gl"/>
+        </w:rPr>
       </w:pPr>
     </w:p>
     <w:p>
       <w:pPr>
-        <w:pStyle w:val="NormalWeb"/>
-        <w:shd w:val="clear" w:color="auto" w:fill="FFFFFF"/>
-        <w:spacing w:before="0" w:beforeAutospacing="0" w:after="0" w:afterAutospacing="0" w:line="360" w:lineRule="auto"/>
-        <w:jc w:val="center"/>
-        <w:rPr>
-          <w:rStyle w:val="Gl"/>
-        </w:rPr>
-      </w:pPr>
-      <w:r>
-        <w:rPr>
+        <w:spacing w:after="0" w:line="360" w:lineRule="auto"/>
+        <w:jc w:val="both"/>
+        <w:rPr>
+          <w:rFonts w:ascii="Times New Roman" w:hAnsi="Times New Roman" w:cs="Times New Roman"/>
           <w:b/>
-          <w:bCs/>
-          <w:lang w:val="en-US"/>
-        </w:rPr>
-        <w:t>AURIS: A multi-model ensemble approach for the detection of AI-generated music</w:t>
+          <w:sz w:val="18"/>
+          <w:szCs w:val="18"/>
+        </w:rPr>
+      </w:pPr>
+      <w:r>
+        <w:rPr>
+          <w:rFonts w:ascii="Times New Roman" w:hAnsi="Times New Roman" w:cs="Times New Roman"/>
+          <w:sz w:val="18"/>
+          <w:szCs w:val="18"/>
+          <w:shd w:val="clear" w:color="auto" w:fill="FFFFFF"/>
+        </w:rPr>
+        <w:t>H</w:t>
+      </w:r>
+      <w:r>
+        <w:rPr>
+          <w:rFonts w:ascii="Times New Roman" w:hAnsi="Times New Roman" w:cs="Times New Roman"/>
+          <w:sz w:val="18"/>
+          <w:szCs w:val="18"/>
+          <w:shd w:val="clear" w:color="auto" w:fill="FFFFFF"/>
+        </w:rPr>
+        <w:t>asan Arthur Altuntaş</w:t>
+      </w:r>
+      <w:proofErr w:type="gramStart"/>
+      <w:r>
+        <w:rPr>
+          <w:rFonts w:ascii="Times New Roman" w:hAnsi="Times New Roman" w:cs="Times New Roman"/>
+          <w:sz w:val="18"/>
+          <w:szCs w:val="18"/>
+          <w:shd w:val="clear" w:color="auto" w:fill="FFFFFF"/>
+          <w:vertAlign w:val="superscript"/>
+        </w:rPr>
+        <w:t>1,*</w:t>
+      </w:r>
+      <w:proofErr w:type="gramEnd"/>
+      <w:r>
+        <w:rPr>
+          <w:rFonts w:ascii="Times New Roman" w:hAnsi="Times New Roman" w:cs="Times New Roman"/>
+          <w:sz w:val="18"/>
+          <w:szCs w:val="18"/>
+          <w:shd w:val="clear" w:color="auto" w:fill="FFFFFF"/>
+        </w:rPr>
+        <w:t>,</w:t>
+      </w:r>
+      <w:r>
+        <w:rPr>
+          <w:rFonts w:ascii="Times New Roman" w:hAnsi="Times New Roman" w:cs="Times New Roman"/>
+          <w:sz w:val="18"/>
+          <w:szCs w:val="18"/>
+          <w:shd w:val="clear" w:color="auto" w:fill="FFFFFF"/>
+        </w:rPr>
+        <w:t xml:space="preserve"> </w:t>
+      </w:r>
+      <w:r>
+        <w:rPr>
+          <w:rFonts w:ascii="Times New Roman" w:hAnsi="Times New Roman" w:cs="Times New Roman"/>
+          <w:sz w:val="18"/>
+          <w:szCs w:val="18"/>
+          <w:shd w:val="clear" w:color="auto" w:fill="FFFFFF"/>
+        </w:rPr>
+        <w:t>Büşra Takgil</w:t>
+      </w:r>
+      <w:r>
+        <w:rPr>
+          <w:rFonts w:ascii="Times New Roman" w:hAnsi="Times New Roman" w:cs="Times New Roman"/>
+          <w:sz w:val="18"/>
+          <w:szCs w:val="18"/>
+          <w:shd w:val="clear" w:color="auto" w:fill="FFFFFF"/>
+          <w:vertAlign w:val="superscript"/>
+        </w:rPr>
+        <w:t>1</w:t>
       </w:r>
     </w:p>
     <w:p>
       <w:pPr>
-        <w:pStyle w:val="NormalWeb"/>
-        <w:shd w:val="clear" w:color="auto" w:fill="FFFFFF"/>
-        <w:spacing w:before="0" w:beforeAutospacing="0" w:after="0" w:afterAutospacing="0" w:line="360" w:lineRule="auto"/>
-        <w:jc w:val="center"/>
-        <w:rPr>
-          <w:rStyle w:val="Gl"/>
-        </w:rPr>
-      </w:pPr>
+        <w:spacing w:after="0" w:line="360" w:lineRule="auto"/>
+        <w:jc w:val="both"/>
+        <w:rPr>
+          <w:rFonts w:ascii="Times New Roman" w:hAnsi="Times New Roman" w:cs="Times New Roman"/>
+          <w:sz w:val="18"/>
+          <w:szCs w:val="18"/>
+          <w:lang w:val="en-US"/>
+        </w:rPr>
+      </w:pPr>
+      <w:r>
+        <w:rPr>
+          <w:rFonts w:ascii="Times New Roman" w:hAnsi="Times New Roman" w:cs="Times New Roman"/>
+          <w:sz w:val="18"/>
+          <w:szCs w:val="18"/>
+          <w:shd w:val="clear" w:color="auto" w:fill="FFFFFF"/>
+          <w:vertAlign w:val="superscript"/>
+        </w:rPr>
+        <w:t>1</w:t>
+      </w:r>
+      <w:r>
+        <w:rPr>
+          <w:rFonts w:ascii="Times New Roman" w:hAnsi="Times New Roman" w:cs="Times New Roman"/>
+          <w:sz w:val="18"/>
+          <w:szCs w:val="18"/>
+          <w:lang w:val="en-US"/>
+        </w:rPr>
+        <w:t xml:space="preserve">Department of Computer Engineering, Faculty of Engineering, </w:t>
+      </w:r>
+      <w:proofErr w:type="spellStart"/>
+      <w:r>
+        <w:rPr>
+          <w:rFonts w:ascii="Times New Roman" w:hAnsi="Times New Roman" w:cs="Times New Roman"/>
+          <w:sz w:val="18"/>
+          <w:szCs w:val="18"/>
+          <w:lang w:val="en-US"/>
+        </w:rPr>
+        <w:t>Düzce</w:t>
+      </w:r>
+      <w:proofErr w:type="spellEnd"/>
+      <w:r>
+        <w:rPr>
+          <w:rFonts w:ascii="Times New Roman" w:hAnsi="Times New Roman" w:cs="Times New Roman"/>
+          <w:sz w:val="18"/>
+          <w:szCs w:val="18"/>
+          <w:lang w:val="en-US"/>
+        </w:rPr>
+        <w:t xml:space="preserve"> University, 81620, </w:t>
+      </w:r>
+      <w:proofErr w:type="spellStart"/>
+      <w:r>
+        <w:rPr>
+          <w:rFonts w:ascii="Times New Roman" w:hAnsi="Times New Roman" w:cs="Times New Roman"/>
+          <w:sz w:val="18"/>
+          <w:szCs w:val="18"/>
+          <w:lang w:val="en-US"/>
+        </w:rPr>
+        <w:t>Düzce</w:t>
+      </w:r>
+      <w:proofErr w:type="spellEnd"/>
+      <w:r>
+        <w:rPr>
+          <w:rFonts w:ascii="Times New Roman" w:hAnsi="Times New Roman" w:cs="Times New Roman"/>
+          <w:sz w:val="18"/>
+          <w:szCs w:val="18"/>
+          <w:lang w:val="en-US"/>
+        </w:rPr>
+        <w:t>, Türkiye</w:t>
+      </w:r>
     </w:p>
     <w:p>
       <w:pPr>
-        <w:pStyle w:val="NormalWeb"/>
-        <w:shd w:val="clear" w:color="auto" w:fill="FFFFFF"/>
-        <w:spacing w:before="0" w:beforeAutospacing="0" w:after="0" w:afterAutospacing="0" w:line="360" w:lineRule="auto"/>
-        <w:jc w:val="center"/>
-      </w:pPr>
-      <w:r>
-        <w:rPr>
-          <w:rStyle w:val="Gl"/>
-        </w:rPr>
-        <w:t>Yazar adları ve adres bilgileri:</w:t>
+        <w:spacing w:after="0" w:line="360" w:lineRule="auto"/>
+        <w:jc w:val="both"/>
+        <w:rPr>
+          <w:rFonts w:ascii="Times New Roman" w:hAnsi="Times New Roman" w:cs="Times New Roman"/>
+          <w:sz w:val="18"/>
+          <w:szCs w:val="18"/>
+          <w:shd w:val="clear" w:color="auto" w:fill="FFFFFF"/>
+        </w:rPr>
+      </w:pPr>
+      <w:r>
+        <w:rPr>
+          <w:rFonts w:ascii="Times New Roman" w:hAnsi="Times New Roman" w:cs="Times New Roman"/>
+          <w:sz w:val="18"/>
+          <w:szCs w:val="18"/>
+          <w:shd w:val="clear" w:color="auto" w:fill="FFFFFF"/>
+        </w:rPr>
+        <w:t>0009-0002-8302-7657</w:t>
+      </w:r>
+      <w:r>
+        <w:rPr>
+          <w:rFonts w:ascii="Times New Roman" w:hAnsi="Times New Roman" w:cs="Times New Roman"/>
+          <w:sz w:val="18"/>
+          <w:szCs w:val="18"/>
+          <w:shd w:val="clear" w:color="auto" w:fill="FFFFFF"/>
+        </w:rPr>
+        <w:t>,</w:t>
+      </w:r>
+      <w:r>
+        <w:rPr>
+          <w:rFonts w:ascii="Times New Roman" w:hAnsi="Times New Roman" w:cs="Times New Roman"/>
+          <w:sz w:val="18"/>
+          <w:szCs w:val="18"/>
+          <w:shd w:val="clear" w:color="auto" w:fill="FFFFFF"/>
+        </w:rPr>
+        <w:t xml:space="preserve"> </w:t>
+      </w:r>
+      <w:r>
+        <w:rPr>
+          <w:rFonts w:ascii="Times New Roman" w:hAnsi="Times New Roman" w:cs="Times New Roman"/>
+          <w:sz w:val="18"/>
+          <w:szCs w:val="18"/>
+          <w:shd w:val="clear" w:color="auto" w:fill="FFFFFF"/>
+        </w:rPr>
+        <w:t>0000-0002-7927-0083</w:t>
       </w:r>
     </w:p>
     <w:p>
       <w:pPr>
-        <w:spacing w:after="0" w:line="360" w:lineRule="auto"/>
-        <w:jc w:val="both"/>
-        <w:rPr>
-          <w:rFonts w:ascii="Times New Roman" w:hAnsi="Times New Roman" w:cs="Times New Roman"/>
-          <w:b/>
-          <w:sz w:val="18"/>
-          <w:szCs w:val="18"/>
-        </w:rPr>
-      </w:pPr>
-      <w:r>
-        <w:rPr>
-          <w:rFonts w:ascii="Times New Roman" w:hAnsi="Times New Roman" w:cs="Times New Roman"/>
-          <w:sz w:val="18"/>
-          <w:szCs w:val="18"/>
-          <w:shd w:val="clear" w:color="auto" w:fill="FFFFFF"/>
-        </w:rPr>
-        <w:t>H</w:t>
-      </w:r>
-      <w:r>
-        <w:rPr>
-          <w:rFonts w:ascii="Times New Roman" w:hAnsi="Times New Roman" w:cs="Times New Roman"/>
-          <w:sz w:val="18"/>
-          <w:szCs w:val="18"/>
-          <w:shd w:val="clear" w:color="auto" w:fill="FFFFFF"/>
-        </w:rPr>
-        <w:t>asan Arthur Altuntaş</w:t>
-      </w:r>
-      <w:proofErr w:type="gramStart"/>
-      <w:r>
-        <w:rPr>
-          <w:rFonts w:ascii="Times New Roman" w:hAnsi="Times New Roman" w:cs="Times New Roman"/>
-          <w:sz w:val="18"/>
-          <w:szCs w:val="18"/>
-          <w:shd w:val="clear" w:color="auto" w:fill="FFFFFF"/>
-          <w:vertAlign w:val="superscript"/>
-        </w:rPr>
-        <w:t>1,*</w:t>
-      </w:r>
-      <w:proofErr w:type="gramEnd"/>
-      <w:r>
-        <w:rPr>
-          <w:rFonts w:ascii="Times New Roman" w:hAnsi="Times New Roman" w:cs="Times New Roman"/>
-          <w:sz w:val="18"/>
-          <w:szCs w:val="18"/>
-          <w:shd w:val="clear" w:color="auto" w:fill="FFFFFF"/>
-        </w:rPr>
-        <w:t>,</w:t>
-      </w:r>
-      <w:r>
-        <w:rPr>
-          <w:rFonts w:ascii="Times New Roman" w:hAnsi="Times New Roman" w:cs="Times New Roman"/>
-          <w:sz w:val="18"/>
-          <w:szCs w:val="18"/>
-          <w:shd w:val="clear" w:color="auto" w:fill="FFFFFF"/>
-        </w:rPr>
-        <w:t xml:space="preserve"> </w:t>
-      </w:r>
-      <w:r>
-        <w:rPr>
-          <w:rFonts w:ascii="Times New Roman" w:hAnsi="Times New Roman" w:cs="Times New Roman"/>
-          <w:sz w:val="18"/>
-          <w:szCs w:val="18"/>
-          <w:shd w:val="clear" w:color="auto" w:fill="FFFFFF"/>
-        </w:rPr>
-        <w:t>Büşra Takgil</w:t>
-      </w:r>
-      <w:r>
-        <w:rPr>
-          <w:rFonts w:ascii="Times New Roman" w:hAnsi="Times New Roman" w:cs="Times New Roman"/>
-          <w:sz w:val="18"/>
-          <w:szCs w:val="18"/>
-          <w:shd w:val="clear" w:color="auto" w:fill="FFFFFF"/>
-          <w:vertAlign w:val="superscript"/>
-        </w:rPr>
-        <w:t>1</w:t>
+        <w:spacing w:after="0" w:line="480" w:lineRule="auto"/>
+        <w:rPr>
+          <w:rFonts w:ascii="Times New Roman" w:hAnsi="Times New Roman" w:cs="Times New Roman"/>
+          <w:sz w:val="18"/>
+          <w:szCs w:val="18"/>
+        </w:rPr>
+      </w:pPr>
+      <w:r>
+        <w:rPr>
+          <w:rFonts w:ascii="Times New Roman" w:hAnsi="Times New Roman" w:cs="Times New Roman"/>
+          <w:sz w:val="18"/>
+          <w:szCs w:val="18"/>
+        </w:rPr>
+        <w:t xml:space="preserve">hasannarthurrr@gmail.com, </w:t>
+      </w:r>
+      <w:r>
+        <w:rPr>
+          <w:rFonts w:ascii="Times New Roman" w:hAnsi="Times New Roman" w:cs="Times New Roman"/>
+          <w:sz w:val="18"/>
+          <w:szCs w:val="18"/>
+        </w:rPr>
+        <w:t>busratakgil@duzce.edu.tr</w:t>
       </w:r>
     </w:p>
     <w:p>
       <w:pPr>
-        <w:spacing w:after="0" w:line="360" w:lineRule="auto"/>
-        <w:jc w:val="both"/>
-        <w:rPr>
-          <w:rFonts w:ascii="Times New Roman" w:hAnsi="Times New Roman" w:cs="Times New Roman"/>
-          <w:sz w:val="18"/>
-          <w:szCs w:val="18"/>
-          <w:lang w:val="en-US"/>
-        </w:rPr>
-      </w:pPr>
-      <w:r>
-        <w:rPr>
-          <w:rFonts w:ascii="Times New Roman" w:hAnsi="Times New Roman" w:cs="Times New Roman"/>
-          <w:sz w:val="18"/>
-          <w:szCs w:val="18"/>
-          <w:shd w:val="clear" w:color="auto" w:fill="FFFFFF"/>
-          <w:vertAlign w:val="superscript"/>
-        </w:rPr>
-        <w:t>1</w:t>
-      </w:r>
-      <w:r>
-        <w:rPr>
-          <w:rFonts w:ascii="Times New Roman" w:hAnsi="Times New Roman" w:cs="Times New Roman"/>
-          <w:sz w:val="18"/>
-          <w:szCs w:val="18"/>
-          <w:lang w:val="en-US"/>
-        </w:rPr>
-        <w:t xml:space="preserve">Department of Computer Engineering, Faculty of Engineering, </w:t>
+        <w:spacing w:after="0" w:line="480" w:lineRule="auto"/>
+        <w:rPr>
+          <w:rFonts w:ascii="Times New Roman" w:hAnsi="Times New Roman" w:cs="Times New Roman"/>
+          <w:sz w:val="18"/>
+          <w:szCs w:val="18"/>
+        </w:rPr>
+      </w:pPr>
+      <w:r>
+        <w:rPr>
+          <w:rFonts w:ascii="Times New Roman" w:hAnsi="Times New Roman" w:cs="Times New Roman"/>
+          <w:sz w:val="18"/>
+          <w:szCs w:val="18"/>
+        </w:rPr>
+        <w:t xml:space="preserve">Phone of </w:t>
       </w:r>
       <w:proofErr w:type="spellStart"/>
       <w:r>
@@ -428,9 +527,8 @@
           <w:rFonts w:ascii="Times New Roman" w:hAnsi="Times New Roman" w:cs="Times New Roman"/>
           <w:sz w:val="18"/>
           <w:szCs w:val="18"/>
-          <w:lang w:val="en-US"/>
-        </w:rPr>
-        <w:t>Düzce</w:t>
+        </w:rPr>
+        <w:t>contact</w:t>
       </w:r>
       <w:proofErr w:type="spellEnd"/>
       <w:r>
@@ -438,9 +536,8 @@
           <w:rFonts w:ascii="Times New Roman" w:hAnsi="Times New Roman" w:cs="Times New Roman"/>
           <w:sz w:val="18"/>
           <w:szCs w:val="18"/>
-          <w:lang w:val="en-US"/>
-        </w:rPr>
-        <w:t xml:space="preserve"> University, 81620, </w:t>
+        </w:rPr>
+        <w:t xml:space="preserve"> </w:t>
       </w:r>
       <w:proofErr w:type="spellStart"/>
       <w:r>
@@ -448,9 +545,8 @@
           <w:rFonts w:ascii="Times New Roman" w:hAnsi="Times New Roman" w:cs="Times New Roman"/>
           <w:sz w:val="18"/>
           <w:szCs w:val="18"/>
-          <w:lang w:val="en-US"/>
-        </w:rPr>
-        <w:t>Düzce</w:t>
+        </w:rPr>
+        <w:t>author</w:t>
       </w:r>
       <w:proofErr w:type="spellEnd"/>
       <w:r>
@@ -458,127 +554,6 @@
           <w:rFonts w:ascii="Times New Roman" w:hAnsi="Times New Roman" w:cs="Times New Roman"/>
           <w:sz w:val="18"/>
           <w:szCs w:val="18"/>
-          <w:lang w:val="en-US"/>
-        </w:rPr>
-        <w:t>, Türkiye</w:t>
-      </w:r>
-    </w:p>
-    <w:p>
-      <w:pPr>
-        <w:spacing w:after="0" w:line="360" w:lineRule="auto"/>
-        <w:jc w:val="both"/>
-        <w:rPr>
-          <w:rFonts w:ascii="Times New Roman" w:hAnsi="Times New Roman" w:cs="Times New Roman"/>
-          <w:sz w:val="18"/>
-          <w:szCs w:val="18"/>
-          <w:shd w:val="clear" w:color="auto" w:fill="FFFFFF"/>
-        </w:rPr>
-      </w:pPr>
-      <w:r>
-        <w:rPr>
-          <w:rFonts w:ascii="Times New Roman" w:hAnsi="Times New Roman" w:cs="Times New Roman"/>
-          <w:sz w:val="18"/>
-          <w:szCs w:val="18"/>
-          <w:shd w:val="clear" w:color="auto" w:fill="FFFFFF"/>
-        </w:rPr>
-        <w:t>0009-0002-8302-7657</w:t>
-      </w:r>
-      <w:r>
-        <w:rPr>
-          <w:rFonts w:ascii="Times New Roman" w:hAnsi="Times New Roman" w:cs="Times New Roman"/>
-          <w:sz w:val="18"/>
-          <w:szCs w:val="18"/>
-          <w:shd w:val="clear" w:color="auto" w:fill="FFFFFF"/>
-        </w:rPr>
-        <w:t>,</w:t>
-      </w:r>
-      <w:r>
-        <w:rPr>
-          <w:rFonts w:ascii="Times New Roman" w:hAnsi="Times New Roman" w:cs="Times New Roman"/>
-          <w:sz w:val="18"/>
-          <w:szCs w:val="18"/>
-          <w:shd w:val="clear" w:color="auto" w:fill="FFFFFF"/>
-        </w:rPr>
-        <w:t xml:space="preserve"> </w:t>
-      </w:r>
-      <w:r>
-        <w:rPr>
-          <w:rFonts w:ascii="Times New Roman" w:hAnsi="Times New Roman" w:cs="Times New Roman"/>
-          <w:sz w:val="18"/>
-          <w:szCs w:val="18"/>
-          <w:shd w:val="clear" w:color="auto" w:fill="FFFFFF"/>
-        </w:rPr>
-        <w:t>0000-0002-7927-0083</w:t>
-      </w:r>
-    </w:p>
-    <w:p>
-      <w:pPr>
-        <w:spacing w:after="0" w:line="480" w:lineRule="auto"/>
-        <w:rPr>
-          <w:rFonts w:ascii="Times New Roman" w:hAnsi="Times New Roman" w:cs="Times New Roman"/>
-          <w:sz w:val="18"/>
-          <w:szCs w:val="18"/>
-        </w:rPr>
-      </w:pPr>
-      <w:r>
-        <w:rPr>
-          <w:rFonts w:ascii="Times New Roman" w:hAnsi="Times New Roman" w:cs="Times New Roman"/>
-          <w:sz w:val="18"/>
-          <w:szCs w:val="18"/>
-        </w:rPr>
-        <w:t xml:space="preserve">hasannarthurrr@gmail.com, </w:t>
-      </w:r>
-    </w:p>
-    <w:p>
-      <w:pPr>
-        <w:spacing w:after="0" w:line="480" w:lineRule="auto"/>
-        <w:rPr>
-          <w:rFonts w:ascii="Times New Roman" w:hAnsi="Times New Roman" w:cs="Times New Roman"/>
-          <w:sz w:val="18"/>
-          <w:szCs w:val="18"/>
-        </w:rPr>
-      </w:pPr>
-      <w:r>
-        <w:rPr>
-          <w:rFonts w:ascii="Times New Roman" w:hAnsi="Times New Roman" w:cs="Times New Roman"/>
-          <w:sz w:val="18"/>
-          <w:szCs w:val="18"/>
-        </w:rPr>
-        <w:t xml:space="preserve">Phone of </w:t>
-      </w:r>
-      <w:proofErr w:type="spellStart"/>
-      <w:r>
-        <w:rPr>
-          <w:rFonts w:ascii="Times New Roman" w:hAnsi="Times New Roman" w:cs="Times New Roman"/>
-          <w:sz w:val="18"/>
-          <w:szCs w:val="18"/>
-        </w:rPr>
-        <w:t>contact</w:t>
-      </w:r>
-      <w:proofErr w:type="spellEnd"/>
-      <w:r>
-        <w:rPr>
-          <w:rFonts w:ascii="Times New Roman" w:hAnsi="Times New Roman" w:cs="Times New Roman"/>
-          <w:sz w:val="18"/>
-          <w:szCs w:val="18"/>
-        </w:rPr>
-        <w:t xml:space="preserve"> </w:t>
-      </w:r>
-      <w:proofErr w:type="spellStart"/>
-      <w:r>
-        <w:rPr>
-          <w:rFonts w:ascii="Times New Roman" w:hAnsi="Times New Roman" w:cs="Times New Roman"/>
-          <w:sz w:val="18"/>
-          <w:szCs w:val="18"/>
-        </w:rPr>
-        <w:t>author</w:t>
-      </w:r>
-      <w:proofErr w:type="spellEnd"/>
-      <w:r>
-        <w:rPr>
-          <w:rFonts w:ascii="Times New Roman" w:hAnsi="Times New Roman" w:cs="Times New Roman"/>
-          <w:sz w:val="18"/>
-          <w:szCs w:val="18"/>
         </w:rPr>
         <w:t xml:space="preserve">: </w:t>
       </w:r>
@@ -588,7 +563,7 @@
           <w:sz w:val="18"/>
           <w:szCs w:val="18"/>
         </w:rPr>
-        <w:t xml:space="preserve">5304757690, </w:t>
+        <w:t>5304757690</w:t>
       </w:r>
     </w:p>
     <w:sectPr>
@@ -1004,7 +979,6 @@
   <w:style w:type="character" w:default="1" w:styleId="VarsaylanParagrafYazTipi">
     <w:name w:val="Default Paragraph Font"/>
     <w:uiPriority w:val="1"/>
-    <w:semiHidden/>
     <w:unhideWhenUsed/>
   </w:style>
   <w:style w:type="table" w:default="1" w:styleId="NormalTablo">

</xml_diff>

<commit_message>
Update AURIS documents with revised titles and remove obsolete files
</commit_message>
<xml_diff>
--- a/docs/academic/paper/deliverables/AURIS_Kapak_Sayfasi.docx
+++ b/docs/academic/paper/deliverables/AURIS_Kapak_Sayfasi.docx
@@ -4,243 +4,295 @@
   <w:body>
     <w:p>
       <w:pPr>
+        <w:spacing w:after="0" w:line="360" w:lineRule="auto"/>
+        <w:jc w:val="both"/>
+        <w:rPr>
+          <w:rFonts w:ascii="Times New Roman" w:eastAsia="Times New Roman" w:hAnsi="Times New Roman" w:cs="Times New Roman"/>
+          <w:b/>
+          <w:bCs/>
+          <w:sz w:val="24"/>
+          <w:szCs w:val="24"/>
+          <w:lang w:eastAsia="tr-TR"/>
+        </w:rPr>
+      </w:pPr>
+      <w:r>
+        <w:rPr>
+          <w:rFonts w:ascii="Times New Roman" w:eastAsia="Times New Roman" w:hAnsi="Times New Roman" w:cs="Times New Roman"/>
+          <w:b/>
+          <w:bCs/>
+          <w:sz w:val="24"/>
+          <w:szCs w:val="24"/>
+          <w:lang w:eastAsia="tr-TR"/>
+        </w:rPr>
+        <w:t xml:space="preserve">Yapay Zekâ Üretimli Müzik Tespitinde Topluluk Öğrenmesi: Heterojen Akustik Öznitelikler ve </w:t>
+      </w:r>
+      <w:proofErr w:type="spellStart"/>
+      <w:r>
+        <w:rPr>
+          <w:rFonts w:ascii="Times New Roman" w:eastAsia="Times New Roman" w:hAnsi="Times New Roman" w:cs="Times New Roman"/>
+          <w:b/>
+          <w:bCs/>
+          <w:sz w:val="24"/>
+          <w:szCs w:val="24"/>
+          <w:lang w:eastAsia="tr-TR"/>
+        </w:rPr>
+        <w:t>LightGBM</w:t>
+      </w:r>
+      <w:proofErr w:type="spellEnd"/>
+      <w:r>
+        <w:rPr>
+          <w:rFonts w:ascii="Times New Roman" w:eastAsia="Times New Roman" w:hAnsi="Times New Roman" w:cs="Times New Roman"/>
+          <w:b/>
+          <w:bCs/>
+          <w:sz w:val="24"/>
+          <w:szCs w:val="24"/>
+          <w:lang w:eastAsia="tr-TR"/>
+        </w:rPr>
+        <w:t xml:space="preserve"> Tabanlı Bir Yaklaşım</w:t>
+      </w:r>
+    </w:p>
+    <w:p>
+      <w:pPr>
+        <w:spacing w:after="0" w:line="360" w:lineRule="auto"/>
+        <w:jc w:val="both"/>
+        <w:rPr>
+          <w:rFonts w:ascii="Times New Roman" w:eastAsia="Times New Roman" w:hAnsi="Times New Roman" w:cs="Times New Roman"/>
+          <w:b/>
+          <w:bCs/>
+          <w:sz w:val="24"/>
+          <w:szCs w:val="24"/>
+          <w:lang w:eastAsia="tr-TR"/>
+        </w:rPr>
+      </w:pPr>
+    </w:p>
+    <w:p>
+      <w:pPr>
+        <w:spacing w:after="0" w:line="360" w:lineRule="auto"/>
+        <w:jc w:val="both"/>
+        <w:rPr>
+          <w:rFonts w:ascii="Times New Roman" w:hAnsi="Times New Roman" w:cs="Times New Roman"/>
+          <w:b/>
+          <w:sz w:val="18"/>
+          <w:szCs w:val="18"/>
+        </w:rPr>
+      </w:pPr>
+      <w:r>
+        <w:rPr>
+          <w:rFonts w:ascii="Times New Roman" w:hAnsi="Times New Roman" w:cs="Times New Roman"/>
+          <w:sz w:val="18"/>
+          <w:szCs w:val="18"/>
+          <w:shd w:val="clear" w:color="auto" w:fill="FFFFFF"/>
+        </w:rPr>
+        <w:t>H</w:t>
+      </w:r>
+      <w:r>
+        <w:rPr>
+          <w:rFonts w:ascii="Times New Roman" w:hAnsi="Times New Roman" w:cs="Times New Roman"/>
+          <w:sz w:val="18"/>
+          <w:szCs w:val="18"/>
+          <w:shd w:val="clear" w:color="auto" w:fill="FFFFFF"/>
+        </w:rPr>
+        <w:t>asan Arthur Altuntaş</w:t>
+      </w:r>
+      <w:proofErr w:type="gramStart"/>
+      <w:r>
+        <w:rPr>
+          <w:rFonts w:ascii="Times New Roman" w:hAnsi="Times New Roman" w:cs="Times New Roman"/>
+          <w:sz w:val="18"/>
+          <w:szCs w:val="18"/>
+          <w:shd w:val="clear" w:color="auto" w:fill="FFFFFF"/>
+          <w:vertAlign w:val="superscript"/>
+        </w:rPr>
+        <w:t>1,*</w:t>
+      </w:r>
+      <w:proofErr w:type="gramEnd"/>
+      <w:r>
+        <w:rPr>
+          <w:rFonts w:ascii="Times New Roman" w:hAnsi="Times New Roman" w:cs="Times New Roman"/>
+          <w:sz w:val="18"/>
+          <w:szCs w:val="18"/>
+          <w:shd w:val="clear" w:color="auto" w:fill="FFFFFF"/>
+        </w:rPr>
+        <w:t>,</w:t>
+      </w:r>
+      <w:r>
+        <w:rPr>
+          <w:rFonts w:ascii="Times New Roman" w:hAnsi="Times New Roman" w:cs="Times New Roman"/>
+          <w:sz w:val="18"/>
+          <w:szCs w:val="18"/>
+          <w:shd w:val="clear" w:color="auto" w:fill="FFFFFF"/>
+        </w:rPr>
+        <w:t xml:space="preserve"> </w:t>
+      </w:r>
+      <w:r>
+        <w:rPr>
+          <w:rFonts w:ascii="Times New Roman" w:hAnsi="Times New Roman" w:cs="Times New Roman"/>
+          <w:sz w:val="18"/>
+          <w:szCs w:val="18"/>
+          <w:shd w:val="clear" w:color="auto" w:fill="FFFFFF"/>
+        </w:rPr>
+        <w:t>Büşra Takgil</w:t>
+      </w:r>
+      <w:r>
+        <w:rPr>
+          <w:rFonts w:ascii="Times New Roman" w:hAnsi="Times New Roman" w:cs="Times New Roman"/>
+          <w:sz w:val="18"/>
+          <w:szCs w:val="18"/>
+          <w:shd w:val="clear" w:color="auto" w:fill="FFFFFF"/>
+          <w:vertAlign w:val="superscript"/>
+        </w:rPr>
+        <w:t>1</w:t>
+      </w:r>
+    </w:p>
+    <w:p>
+      <w:pPr>
+        <w:spacing w:after="0" w:line="360" w:lineRule="auto"/>
+        <w:jc w:val="both"/>
+        <w:rPr>
+          <w:rFonts w:ascii="Times New Roman" w:hAnsi="Times New Roman" w:cs="Times New Roman"/>
+          <w:sz w:val="18"/>
+          <w:szCs w:val="18"/>
+        </w:rPr>
+      </w:pPr>
+      <w:r>
+        <w:rPr>
+          <w:rFonts w:ascii="Times New Roman" w:hAnsi="Times New Roman" w:cs="Times New Roman"/>
+          <w:sz w:val="18"/>
+          <w:szCs w:val="18"/>
+          <w:shd w:val="clear" w:color="auto" w:fill="FFFFFF"/>
+          <w:vertAlign w:val="superscript"/>
+        </w:rPr>
+        <w:t>1</w:t>
+      </w:r>
+      <w:r>
+        <w:rPr>
+          <w:rFonts w:ascii="Times New Roman" w:hAnsi="Times New Roman" w:cs="Times New Roman"/>
+          <w:sz w:val="18"/>
+          <w:szCs w:val="18"/>
+        </w:rPr>
+        <w:t>Düzce Üniversitesi, Mühendislik Fakültesi, Bilgisayar Mühendisliği Bölümü, 81620, Düzce, Türkiye</w:t>
+      </w:r>
+    </w:p>
+    <w:p>
+      <w:pPr>
+        <w:spacing w:after="0" w:line="360" w:lineRule="auto"/>
+        <w:jc w:val="both"/>
+        <w:rPr>
+          <w:rFonts w:ascii="Times New Roman" w:hAnsi="Times New Roman" w:cs="Times New Roman"/>
+          <w:sz w:val="18"/>
+          <w:szCs w:val="18"/>
+          <w:shd w:val="clear" w:color="auto" w:fill="FFFFFF"/>
+        </w:rPr>
+      </w:pPr>
+      <w:r>
+        <w:rPr>
+          <w:rFonts w:ascii="Times New Roman" w:hAnsi="Times New Roman" w:cs="Times New Roman"/>
+          <w:sz w:val="18"/>
+          <w:szCs w:val="18"/>
+          <w:shd w:val="clear" w:color="auto" w:fill="FFFFFF"/>
+        </w:rPr>
+        <w:t>0009-0002-8302-7657</w:t>
+      </w:r>
+      <w:r>
+        <w:rPr>
+          <w:rFonts w:ascii="Times New Roman" w:hAnsi="Times New Roman" w:cs="Times New Roman"/>
+          <w:sz w:val="18"/>
+          <w:szCs w:val="18"/>
+          <w:shd w:val="clear" w:color="auto" w:fill="FFFFFF"/>
+        </w:rPr>
+        <w:t>,</w:t>
+      </w:r>
+      <w:r>
+        <w:rPr>
+          <w:rFonts w:ascii="Times New Roman" w:hAnsi="Times New Roman" w:cs="Times New Roman"/>
+          <w:sz w:val="18"/>
+          <w:szCs w:val="18"/>
+          <w:shd w:val="clear" w:color="auto" w:fill="FFFFFF"/>
+        </w:rPr>
+        <w:t xml:space="preserve"> </w:t>
+      </w:r>
+      <w:r>
+        <w:rPr>
+          <w:rFonts w:ascii="Times New Roman" w:hAnsi="Times New Roman" w:cs="Times New Roman"/>
+          <w:sz w:val="18"/>
+          <w:szCs w:val="18"/>
+          <w:shd w:val="clear" w:color="auto" w:fill="FFFFFF"/>
+        </w:rPr>
+        <w:t>0000-0002-7927-0083</w:t>
+      </w:r>
+    </w:p>
+    <w:p>
+      <w:pPr>
+        <w:spacing w:after="0" w:line="480" w:lineRule="auto"/>
+        <w:rPr>
+          <w:rFonts w:ascii="Times New Roman" w:hAnsi="Times New Roman" w:cs="Times New Roman"/>
+          <w:sz w:val="18"/>
+          <w:szCs w:val="18"/>
+        </w:rPr>
+      </w:pPr>
+      <w:r>
+        <w:rPr>
+          <w:rFonts w:ascii="Times New Roman" w:hAnsi="Times New Roman" w:cs="Times New Roman"/>
+          <w:sz w:val="18"/>
+          <w:szCs w:val="18"/>
+        </w:rPr>
+        <w:t xml:space="preserve">hasannarthurrr@gmail.com, </w:t>
+      </w:r>
+      <w:r>
+        <w:rPr>
+          <w:rFonts w:ascii="Times New Roman" w:hAnsi="Times New Roman" w:cs="Times New Roman"/>
+          <w:sz w:val="18"/>
+          <w:szCs w:val="18"/>
+        </w:rPr>
+        <w:t>busratakgil@duzce.edu.tr</w:t>
+      </w:r>
+    </w:p>
+    <w:p>
+      <w:pPr>
+        <w:spacing w:after="0" w:line="480" w:lineRule="auto"/>
+      </w:pPr>
+      <w:r>
+        <w:rPr>
+          <w:rFonts w:ascii="Times New Roman" w:hAnsi="Times New Roman" w:cs="Times New Roman"/>
+          <w:sz w:val="18"/>
+          <w:szCs w:val="18"/>
+        </w:rPr>
+        <w:t xml:space="preserve">İletişim yazarı telefon </w:t>
+      </w:r>
+      <w:proofErr w:type="spellStart"/>
+      <w:r>
+        <w:rPr>
+          <w:rFonts w:ascii="Times New Roman" w:hAnsi="Times New Roman" w:cs="Times New Roman"/>
+          <w:sz w:val="18"/>
+          <w:szCs w:val="18"/>
+        </w:rPr>
+        <w:t>no</w:t>
+      </w:r>
+      <w:proofErr w:type="spellEnd"/>
+      <w:r>
+        <w:rPr>
+          <w:rFonts w:ascii="Times New Roman" w:hAnsi="Times New Roman" w:cs="Times New Roman"/>
+          <w:sz w:val="18"/>
+          <w:szCs w:val="18"/>
+        </w:rPr>
+        <w:t xml:space="preserve">: </w:t>
+      </w:r>
+      <w:r>
+        <w:rPr>
+          <w:rFonts w:ascii="Times New Roman" w:hAnsi="Times New Roman" w:cs="Times New Roman"/>
+          <w:sz w:val="18"/>
+          <w:szCs w:val="18"/>
+        </w:rPr>
+        <w:t>5304757690</w:t>
+      </w:r>
+    </w:p>
+    <w:p>
+      <w:pPr>
         <w:pStyle w:val="NormalWeb"/>
         <w:shd w:val="clear" w:color="auto" w:fill="FFFFFF"/>
         <w:spacing w:before="0" w:beforeAutospacing="0" w:after="0" w:afterAutospacing="0" w:line="360" w:lineRule="auto"/>
         <w:jc w:val="center"/>
-        <w:rPr>
-          <w:b/>
-          <w:bCs/>
-        </w:rPr>
-      </w:pPr>
-      <w:r>
-        <w:rPr>
-          <w:b/>
-          <w:bCs/>
-        </w:rPr>
-        <w:t>AURIS: Çoklu-model topluluk yaklaşımı ile yapay zekâ tarafından üretilen müziklerin tespiti</w:t>
-      </w:r>
-    </w:p>
-    <w:p>
-      <w:pPr>
-        <w:spacing w:after="0" w:line="360" w:lineRule="auto"/>
-        <w:jc w:val="both"/>
-        <w:rPr>
-          <w:rFonts w:ascii="Times New Roman" w:hAnsi="Times New Roman" w:cs="Times New Roman"/>
-          <w:b/>
-          <w:sz w:val="18"/>
-          <w:szCs w:val="18"/>
-        </w:rPr>
-      </w:pPr>
-      <w:r>
-        <w:rPr>
-          <w:rFonts w:ascii="Times New Roman" w:hAnsi="Times New Roman" w:cs="Times New Roman"/>
-          <w:sz w:val="18"/>
-          <w:szCs w:val="18"/>
-          <w:shd w:val="clear" w:color="auto" w:fill="FFFFFF"/>
-        </w:rPr>
-        <w:t>H</w:t>
-      </w:r>
-      <w:r>
-        <w:rPr>
-          <w:rFonts w:ascii="Times New Roman" w:hAnsi="Times New Roman" w:cs="Times New Roman"/>
-          <w:sz w:val="18"/>
-          <w:szCs w:val="18"/>
-          <w:shd w:val="clear" w:color="auto" w:fill="FFFFFF"/>
-        </w:rPr>
-        <w:t>asan Arthur Altuntaş</w:t>
-      </w:r>
-      <w:proofErr w:type="gramStart"/>
-      <w:r>
-        <w:rPr>
-          <w:rFonts w:ascii="Times New Roman" w:hAnsi="Times New Roman" w:cs="Times New Roman"/>
-          <w:sz w:val="18"/>
-          <w:szCs w:val="18"/>
-          <w:shd w:val="clear" w:color="auto" w:fill="FFFFFF"/>
-          <w:vertAlign w:val="superscript"/>
-        </w:rPr>
-        <w:t>1,*</w:t>
-      </w:r>
-      <w:proofErr w:type="gramEnd"/>
-      <w:r>
-        <w:rPr>
-          <w:rFonts w:ascii="Times New Roman" w:hAnsi="Times New Roman" w:cs="Times New Roman"/>
-          <w:sz w:val="18"/>
-          <w:szCs w:val="18"/>
-          <w:shd w:val="clear" w:color="auto" w:fill="FFFFFF"/>
-        </w:rPr>
-        <w:t>,</w:t>
-      </w:r>
-      <w:r>
-        <w:rPr>
-          <w:rFonts w:ascii="Times New Roman" w:hAnsi="Times New Roman" w:cs="Times New Roman"/>
-          <w:sz w:val="18"/>
-          <w:szCs w:val="18"/>
-          <w:shd w:val="clear" w:color="auto" w:fill="FFFFFF"/>
-        </w:rPr>
-        <w:t xml:space="preserve"> </w:t>
-      </w:r>
-      <w:r>
-        <w:rPr>
-          <w:rFonts w:ascii="Times New Roman" w:hAnsi="Times New Roman" w:cs="Times New Roman"/>
-          <w:sz w:val="18"/>
-          <w:szCs w:val="18"/>
-          <w:shd w:val="clear" w:color="auto" w:fill="FFFFFF"/>
-        </w:rPr>
-        <w:t>Büşra Takgil</w:t>
-      </w:r>
-      <w:r>
-        <w:rPr>
-          <w:rFonts w:ascii="Times New Roman" w:hAnsi="Times New Roman" w:cs="Times New Roman"/>
-          <w:sz w:val="18"/>
-          <w:szCs w:val="18"/>
-          <w:shd w:val="clear" w:color="auto" w:fill="FFFFFF"/>
-          <w:vertAlign w:val="superscript"/>
-        </w:rPr>
-        <w:t>1</w:t>
-      </w:r>
-    </w:p>
-    <w:p>
-      <w:pPr>
-        <w:spacing w:after="0" w:line="360" w:lineRule="auto"/>
-        <w:jc w:val="both"/>
-        <w:rPr>
-          <w:rFonts w:ascii="Times New Roman" w:hAnsi="Times New Roman" w:cs="Times New Roman"/>
-          <w:sz w:val="18"/>
-          <w:szCs w:val="18"/>
-        </w:rPr>
-      </w:pPr>
-      <w:r>
-        <w:rPr>
-          <w:rFonts w:ascii="Times New Roman" w:hAnsi="Times New Roman" w:cs="Times New Roman"/>
-          <w:sz w:val="18"/>
-          <w:szCs w:val="18"/>
-          <w:shd w:val="clear" w:color="auto" w:fill="FFFFFF"/>
-          <w:vertAlign w:val="superscript"/>
-        </w:rPr>
-        <w:t>1</w:t>
-      </w:r>
-      <w:r>
-        <w:rPr>
-          <w:rFonts w:ascii="Times New Roman" w:hAnsi="Times New Roman" w:cs="Times New Roman"/>
-          <w:sz w:val="18"/>
-          <w:szCs w:val="18"/>
-        </w:rPr>
-        <w:t>Düzce Üniversitesi, Mühendislik Fakültesi, Bilgisayar Mühendisliği Bölümü, 81620, Düzce, Türkiye</w:t>
-      </w:r>
-    </w:p>
-    <w:p>
-      <w:pPr>
-        <w:spacing w:after="0" w:line="360" w:lineRule="auto"/>
-        <w:jc w:val="both"/>
-        <w:rPr>
-          <w:rFonts w:ascii="Times New Roman" w:hAnsi="Times New Roman" w:cs="Times New Roman"/>
-          <w:sz w:val="18"/>
-          <w:szCs w:val="18"/>
-          <w:shd w:val="clear" w:color="auto" w:fill="FFFFFF"/>
-        </w:rPr>
-      </w:pPr>
-      <w:r>
-        <w:rPr>
-          <w:rFonts w:ascii="Times New Roman" w:hAnsi="Times New Roman" w:cs="Times New Roman"/>
-          <w:sz w:val="18"/>
-          <w:szCs w:val="18"/>
-          <w:shd w:val="clear" w:color="auto" w:fill="FFFFFF"/>
-        </w:rPr>
-        <w:t>0009-0002-8302-7657</w:t>
-      </w:r>
-      <w:r>
-        <w:rPr>
-          <w:rFonts w:ascii="Times New Roman" w:hAnsi="Times New Roman" w:cs="Times New Roman"/>
-          <w:sz w:val="18"/>
-          <w:szCs w:val="18"/>
-          <w:shd w:val="clear" w:color="auto" w:fill="FFFFFF"/>
-        </w:rPr>
-        <w:t>,</w:t>
-      </w:r>
-      <w:r>
-        <w:rPr>
-          <w:rFonts w:ascii="Times New Roman" w:hAnsi="Times New Roman" w:cs="Times New Roman"/>
-          <w:sz w:val="18"/>
-          <w:szCs w:val="18"/>
-          <w:shd w:val="clear" w:color="auto" w:fill="FFFFFF"/>
-        </w:rPr>
-        <w:t xml:space="preserve"> </w:t>
-      </w:r>
-      <w:r>
-        <w:rPr>
-          <w:rFonts w:ascii="Times New Roman" w:hAnsi="Times New Roman" w:cs="Times New Roman"/>
-          <w:sz w:val="18"/>
-          <w:szCs w:val="18"/>
-          <w:shd w:val="clear" w:color="auto" w:fill="FFFFFF"/>
-        </w:rPr>
-        <w:t>0000-0002-7927-0083</w:t>
-      </w:r>
-    </w:p>
-    <w:p>
-      <w:pPr>
-        <w:spacing w:after="0" w:line="480" w:lineRule="auto"/>
-        <w:rPr>
-          <w:rFonts w:ascii="Times New Roman" w:hAnsi="Times New Roman" w:cs="Times New Roman"/>
-          <w:sz w:val="18"/>
-          <w:szCs w:val="18"/>
-        </w:rPr>
-      </w:pPr>
-      <w:r>
-        <w:rPr>
-          <w:rFonts w:ascii="Times New Roman" w:hAnsi="Times New Roman" w:cs="Times New Roman"/>
-          <w:sz w:val="18"/>
-          <w:szCs w:val="18"/>
-        </w:rPr>
-        <w:t xml:space="preserve">hasannarthurrr@gmail.com, </w:t>
-      </w:r>
-      <w:r>
-        <w:rPr>
-          <w:rFonts w:ascii="Times New Roman" w:hAnsi="Times New Roman" w:cs="Times New Roman"/>
-          <w:sz w:val="18"/>
-          <w:szCs w:val="18"/>
-        </w:rPr>
-        <w:t>busratakgil@duzce.edu.tr</w:t>
-      </w:r>
-    </w:p>
-    <w:p>
-      <w:pPr>
-        <w:spacing w:after="0" w:line="480" w:lineRule="auto"/>
-      </w:pPr>
-      <w:r>
-        <w:rPr>
-          <w:rFonts w:ascii="Times New Roman" w:hAnsi="Times New Roman" w:cs="Times New Roman"/>
-          <w:sz w:val="18"/>
-          <w:szCs w:val="18"/>
-        </w:rPr>
-        <w:t xml:space="preserve">İletişim yazarı telefon </w:t>
-      </w:r>
-      <w:proofErr w:type="spellStart"/>
-      <w:r>
-        <w:rPr>
-          <w:rFonts w:ascii="Times New Roman" w:hAnsi="Times New Roman" w:cs="Times New Roman"/>
-          <w:sz w:val="18"/>
-          <w:szCs w:val="18"/>
-        </w:rPr>
-        <w:t>no</w:t>
-      </w:r>
-      <w:proofErr w:type="spellEnd"/>
-      <w:r>
-        <w:rPr>
-          <w:rFonts w:ascii="Times New Roman" w:hAnsi="Times New Roman" w:cs="Times New Roman"/>
-          <w:sz w:val="18"/>
-          <w:szCs w:val="18"/>
-        </w:rPr>
-        <w:t xml:space="preserve">: </w:t>
-      </w:r>
-      <w:r>
-        <w:rPr>
-          <w:rFonts w:ascii="Times New Roman" w:hAnsi="Times New Roman" w:cs="Times New Roman"/>
-          <w:sz w:val="18"/>
-          <w:szCs w:val="18"/>
-        </w:rPr>
-        <w:t>5304757690</w:t>
-      </w:r>
+      </w:pPr>
     </w:p>
     <w:p>
       <w:pPr>
@@ -248,25 +300,37 @@
         <w:shd w:val="clear" w:color="auto" w:fill="FFFFFF"/>
         <w:spacing w:before="0" w:beforeAutospacing="0" w:after="0" w:afterAutospacing="0" w:line="360" w:lineRule="auto"/>
         <w:jc w:val="center"/>
-      </w:pPr>
-    </w:p>
-    <w:p>
-      <w:pPr>
-        <w:pStyle w:val="NormalWeb"/>
-        <w:shd w:val="clear" w:color="auto" w:fill="FFFFFF"/>
-        <w:spacing w:before="0" w:beforeAutospacing="0" w:after="0" w:afterAutospacing="0" w:line="360" w:lineRule="auto"/>
-        <w:jc w:val="center"/>
-        <w:rPr>
-          <w:rStyle w:val="Gl"/>
-        </w:rPr>
-      </w:pPr>
-      <w:r>
         <w:rPr>
           <w:b/>
           <w:bCs/>
           <w:lang w:val="en-US"/>
         </w:rPr>
-        <w:t>AURIS: A multi-model ensemble approach for the detection of AI-generated music</w:t>
+      </w:pPr>
+      <w:r>
+        <w:rPr>
+          <w:b/>
+          <w:bCs/>
+          <w:lang w:val="en-US"/>
+        </w:rPr>
+        <w:t xml:space="preserve">Community Learning in the Detection of AI-Generated Music: A </w:t>
+      </w:r>
+      <w:proofErr w:type="spellStart"/>
+      <w:r>
+        <w:rPr>
+          <w:b/>
+          <w:bCs/>
+          <w:lang w:val="en-US"/>
+        </w:rPr>
+        <w:t>LightGBM</w:t>
+      </w:r>
+      <w:proofErr w:type="spellEnd"/>
+      <w:r>
+        <w:rPr>
+          <w:b/>
+          <w:bCs/>
+          <w:lang w:val="en-US"/>
+        </w:rPr>
+        <w:t>-Based Approach Using Heterogeneous Acoustic Features</w:t>
       </w:r>
     </w:p>
     <w:p>

</xml_diff>